<commit_message>
feat: Fase 3: Teste de Mutação (A Prova de Fogo do Código)
</commit_message>
<xml_diff>
--- a/docs/Fase2-Relatorio.docx
+++ b/docs/Fase2-Relatorio.docx
@@ -4,7 +4,7 @@
   <w:body>
     <w:p>
       <w:pPr>
-        <w:spacing w:after="120" w:before="2400"/>
+        <w:spacing w:before="2400" w:after="120"/>
         <w:jc w:val="center"/>
       </w:pPr>
       <w:r>
@@ -820,9 +820,9 @@
       </w:pPr>
       <w:r>
         <w:rPr>
-          <w:rFonts w:ascii="Consolas" w:cs="Consolas" w:eastAsia="Consolas" w:hAnsi="Consolas"/>
           <w:sz w:val="20"/>
           <w:szCs w:val="20"/>
+          <w:rFonts w:ascii="Consolas" w:cs="Consolas" w:eastAsia="Consolas" w:hAnsi="Consolas"/>
         </w:rPr>
         <w:t xml:space="preserve">validar(RN01) → breaker( retry( timeout( gateway ) ) ) → persistir + notificar</w:t>
       </w:r>
@@ -1568,9 +1568,9 @@
       </w:pPr>
       <w:r>
         <w:rPr>
-          <w:rFonts w:ascii="Consolas" w:cs="Consolas" w:eastAsia="Consolas" w:hAnsi="Consolas"/>
           <w:sz w:val="20"/>
           <w:szCs w:val="20"/>
+          <w:rFonts w:ascii="Consolas" w:cs="Consolas" w:eastAsia="Consolas" w:hAnsi="Consolas"/>
         </w:rPr>
         <w:t xml:space="preserve">PedidoMother.aprovavel();              // pedido canônico válido</w:t>
       </w:r>
@@ -1582,9 +1582,9 @@
       </w:pPr>
       <w:r>
         <w:rPr>
-          <w:rFonts w:ascii="Consolas" w:cs="Consolas" w:eastAsia="Consolas" w:hAnsi="Consolas"/>
           <w:sz w:val="20"/>
           <w:szCs w:val="20"/>
+          <w:rFonts w:ascii="Consolas" w:cs="Consolas" w:eastAsia="Consolas" w:hAnsi="Consolas"/>
         </w:rPr>
         <w:t xml:space="preserve">PedidoMother.base().comValor(9999).build(); // ajuste pontual via builder</w:t>
       </w:r>
@@ -2104,9 +2104,9 @@
       </w:pPr>
       <w:r>
         <w:rPr>
-          <w:rFonts w:ascii="Consolas" w:cs="Consolas" w:eastAsia="Consolas" w:hAnsi="Consolas"/>
           <w:sz w:val="20"/>
           <w:szCs w:val="20"/>
+          <w:rFonts w:ascii="Consolas" w:cs="Consolas" w:eastAsia="Consolas" w:hAnsi="Consolas"/>
         </w:rPr>
         <w:t xml:space="preserve">Cenário: Cartão recusado não dispara e-mail (Fluxo 2)</w:t>
       </w:r>
@@ -2118,9 +2118,9 @@
       </w:pPr>
       <w:r>
         <w:rPr>
-          <w:rFonts w:ascii="Consolas" w:cs="Consolas" w:eastAsia="Consolas" w:hAnsi="Consolas"/>
           <w:sz w:val="20"/>
           <w:szCs w:val="20"/>
+          <w:rFonts w:ascii="Consolas" w:cs="Consolas" w:eastAsia="Consolas" w:hAnsi="Consolas"/>
         </w:rPr>
         <w:t xml:space="preserve">  Dado que o gateway de pagamento responde "RECUSADO"</w:t>
       </w:r>
@@ -2132,9 +2132,9 @@
       </w:pPr>
       <w:r>
         <w:rPr>
-          <w:rFonts w:ascii="Consolas" w:cs="Consolas" w:eastAsia="Consolas" w:hAnsi="Consolas"/>
           <w:sz w:val="20"/>
           <w:szCs w:val="20"/>
+          <w:rFonts w:ascii="Consolas" w:cs="Consolas" w:eastAsia="Consolas" w:hAnsi="Consolas"/>
         </w:rPr>
         <w:t xml:space="preserve">  Quando o checkout é processado</w:t>
       </w:r>
@@ -2146,9 +2146,9 @@
       </w:pPr>
       <w:r>
         <w:rPr>
-          <w:rFonts w:ascii="Consolas" w:cs="Consolas" w:eastAsia="Consolas" w:hAnsi="Consolas"/>
           <w:sz w:val="20"/>
           <w:szCs w:val="20"/>
+          <w:rFonts w:ascii="Consolas" w:cs="Consolas" w:eastAsia="Consolas" w:hAnsi="Consolas"/>
         </w:rPr>
         <w:t xml:space="preserve">  Então o pedido deve ter status "FALHOU"</w:t>
       </w:r>
@@ -2160,9 +2160,9 @@
       </w:pPr>
       <w:r>
         <w:rPr>
-          <w:rFonts w:ascii="Consolas" w:cs="Consolas" w:eastAsia="Consolas" w:hAnsi="Consolas"/>
           <w:sz w:val="20"/>
           <w:szCs w:val="20"/>
+          <w:rFonts w:ascii="Consolas" w:cs="Consolas" w:eastAsia="Consolas" w:hAnsi="Consolas"/>
         </w:rPr>
         <w:t xml:space="preserve">  E o e-mail de confirmação não deve ser enviado</w:t>
       </w:r>
@@ -3200,43 +3200,6 @@
 
 <file path=word/comments.xml><?xml version="1.0" encoding="utf-8"?>
 <w:comments xmlns:cx="http://schemas.microsoft.com/office/drawing/2014/chartex" xmlns:cx1="http://schemas.microsoft.com/office/drawing/2015/9/8/chartex" xmlns:cx2="http://schemas.microsoft.com/office/drawing/2015/10/21/chartex" xmlns:cx3="http://schemas.microsoft.com/office/drawing/2016/5/9/chartex" xmlns:cx4="http://schemas.microsoft.com/office/drawing/2016/5/10/chartex" xmlns:cx5="http://schemas.microsoft.com/office/drawing/2016/5/11/chartex" xmlns:cx6="http://schemas.microsoft.com/office/drawing/2016/5/12/chartex" xmlns:cx7="http://schemas.microsoft.com/office/drawing/2016/5/13/chartex" xmlns:cx8="http://schemas.microsoft.com/office/drawing/2016/5/14/chartex" xmlns:mc="http://schemas.openxmlformats.org/markup-compatibility/2006" xmlns:aink="http://schemas.microsoft.com/office/drawing/2016/ink" xmlns:am3d="http://schemas.microsoft.com/office/drawing/2017/model3d" xmlns:o="urn:schemas-microsoft-com:office:office" xmlns:r="http://schemas.openxmlformats.org/officeDocument/2006/relationships" xmlns:m="http://schemas.openxmlformats.org/officeDocument/2006/math" xmlns:v="urn:schemas-microsoft-com:vml" xmlns:wp14="http://schemas.microsoft.com/office/word/2010/wordprocessingDrawing" xmlns:wp="http://schemas.openxmlformats.org/drawingml/2006/wordprocessingDrawing" xmlns:w10="urn:schemas-microsoft-com:office:word" xmlns:w="http://schemas.openxmlformats.org/wordprocessingml/2006/main" xmlns:w14="http://schemas.microsoft.com/office/word/2010/wordml" xmlns:w15="http://schemas.microsoft.com/office/word/2012/wordml" xmlns:w16cex="http://schemas.microsoft.com/office/word/2018/wordml/cex" xmlns:w16cid="http://schemas.microsoft.com/office/word/2016/wordml/cid" xmlns:w16="http://schemas.microsoft.com/office/word/2018/wordml" xmlns:w16sdtdh="http://schemas.microsoft.com/office/word/2020/wordml/sdtdatahash" xmlns:w16se="http://schemas.microsoft.com/office/word/2015/wordml/symex" xmlns:wpg="http://schemas.microsoft.com/office/word/2010/wordprocessingGroup" xmlns:wpi="http://schemas.microsoft.com/office/word/2010/wordprocessingInk" xmlns:wne="http://schemas.microsoft.com/office/word/2006/wordml" xmlns:wps="http://schemas.microsoft.com/office/word/2010/wordprocessingShape"/>
-</file>
-
-<file path=word/endnotes.xml><?xml version="1.0" encoding="utf-8"?>
-<w:endnotes xmlns:wpc="http://schemas.microsoft.com/office/word/2010/wordprocessingCanvas" xmlns:mc="http://schemas.openxmlformats.org/markup-compatibility/2006" xmlns:o="urn:schemas-microsoft-com:office:office" xmlns:r="http://schemas.openxmlformats.org/officeDocument/2006/relationships" xmlns:m="http://schemas.openxmlformats.org/officeDocument/2006/math" xmlns:v="urn:schemas-microsoft-com:vml" xmlns:wp14="http://schemas.microsoft.com/office/word/2010/wordprocessingDrawing" xmlns:wp="http://schemas.openxmlformats.org/drawingml/2006/wordprocessingDrawing" xmlns:w10="urn:schemas-microsoft-com:office:word" xmlns:w="http://schemas.openxmlformats.org/wordprocessingml/2006/main" xmlns:w14="http://schemas.microsoft.com/office/word/2010/wordml" xmlns:w15="http://schemas.microsoft.com/office/word/2012/wordml" xmlns:wpg="http://schemas.microsoft.com/office/word/2010/wordprocessingGroup" xmlns:wpi="http://schemas.microsoft.com/office/word/2010/wordprocessingInk" xmlns:wne="http://schemas.microsoft.com/office/word/2006/wordml" xmlns:wps="http://schemas.microsoft.com/office/word/2010/wordprocessingShape" mc:Ignorable="w14 w15 wp14">
-  <w:endnote w:type="separator" w:id="-1">
-    <w:p>
-      <w:pPr>
-        <w:spacing w:after="0" w:line="240" w:lineRule="auto"/>
-      </w:pPr>
-      <w:r>
-        <w:rPr>
-          <w:rStyle w:val="EndnoteReference"/>
-        </w:rPr>
-        <w:endnoteRef/>
-      </w:r>
-      <w:r>
-        <w:separator/>
-      </w:r>
-    </w:p>
-  </w:endnote>
-  <w:endnote w:type="continuationSeparator" w:id="0">
-    <w:p>
-      <w:pPr>
-        <w:spacing w:after="0" w:line="240" w:lineRule="auto"/>
-      </w:pPr>
-      <w:r>
-        <w:rPr>
-          <w:rStyle w:val="EndnoteReference"/>
-        </w:rPr>
-        <w:endnoteRef/>
-      </w:r>
-      <w:r>
-        <w:continuationSeparator/>
-      </w:r>
-    </w:p>
-  </w:endnote>
-</w:endnotes>
 </file>
 
 <file path=word/footnotes.xml><?xml version="1.0" encoding="utf-8"?>
@@ -3394,9 +3357,9 @@
   <w:docDefaults>
     <w:rPrDefault>
       <w:rPr>
-        <w:rFonts w:ascii="Arial" w:cs="Arial" w:eastAsia="Arial" w:hAnsi="Arial"/>
         <w:sz w:val="24"/>
         <w:szCs w:val="24"/>
+        <w:rFonts w:ascii="Arial" w:cs="Arial" w:eastAsia="Arial" w:hAnsi="Arial"/>
       </w:rPr>
     </w:rPrDefault>
     <w:pPrDefault/>
@@ -3494,8 +3457,8 @@
     <w:uiPriority w:val="99"/>
     <w:unhideWhenUsed/>
     <w:rPr>
+      <w:u w:val="single"/>
       <w:color w:val="0563C1"/>
-      <w:u w:val="single"/>
     </w:rPr>
   </w:style>
   <w:style w:type="character" w:styleId="FootnoteReference">
@@ -3535,59 +3498,22 @@
       <w:szCs w:val="20"/>
     </w:rPr>
   </w:style>
-  <w:style w:type="character" w:styleId="EndnoteReference">
-    <w:name w:val="endnote reference"/>
-    <w:basedOn w:val="DefaultParagraphFont"/>
-    <w:uiPriority w:val="99"/>
-    <w:semiHidden/>
-    <w:unhideWhenUsed/>
-    <w:rPr>
-      <w:vertAlign w:val="superscript"/>
-    </w:rPr>
-  </w:style>
-  <w:style w:type="paragraph" w:styleId="EndnoteText">
-    <w:name w:val="endnote text"/>
-    <w:basedOn w:val="Normal"/>
-    <w:link w:val="EndnoteTextChar"/>
-    <w:uiPriority w:val="99"/>
-    <w:semiHidden/>
-    <w:unhideWhenUsed/>
-    <w:pPr>
-      <w:spacing w:after="0" w:line="240" w:lineRule="auto"/>
-    </w:pPr>
-    <w:rPr>
-      <w:sz w:val="20"/>
-      <w:szCs w:val="20"/>
-    </w:rPr>
-  </w:style>
-  <w:style w:type="character" w:styleId="EndnoteTextChar">
-    <w:name w:val="Endnote Text Char"/>
-    <w:basedOn w:val="DefaultParagraphFont"/>
-    <w:link w:val="EndnoteText"/>
-    <w:uiPriority w:val="99"/>
-    <w:semiHidden/>
-    <w:unhideWhenUsed/>
-    <w:rPr>
-      <w:sz w:val="20"/>
-      <w:szCs w:val="20"/>
-    </w:rPr>
-  </w:style>
   <w:style w:type="paragraph" w:styleId="Heading1">
     <w:name w:val="Heading 1"/>
     <w:basedOn w:val="Normal"/>
     <w:next w:val="Normal"/>
     <w:qFormat/>
     <w:pPr>
-      <w:spacing w:after="160" w:before="280"/>
+      <w:spacing w:before="280" w:after="160"/>
       <w:outlineLvl w:val="0"/>
     </w:pPr>
     <w:rPr>
-      <w:rFonts w:ascii="Arial" w:cs="Arial" w:eastAsia="Arial" w:hAnsi="Arial"/>
       <w:b/>
       <w:bCs/>
       <w:color w:val="1F4E78"/>
       <w:sz w:val="30"/>
       <w:szCs w:val="30"/>
+      <w:rFonts w:ascii="Arial" w:cs="Arial" w:eastAsia="Arial" w:hAnsi="Arial"/>
     </w:rPr>
   </w:style>
   <w:style w:type="paragraph" w:styleId="Heading2">
@@ -3596,16 +3522,16 @@
     <w:next w:val="Normal"/>
     <w:qFormat/>
     <w:pPr>
-      <w:spacing w:after="120" w:before="200"/>
+      <w:spacing w:before="200" w:after="120"/>
       <w:outlineLvl w:val="1"/>
     </w:pPr>
     <w:rPr>
-      <w:rFonts w:ascii="Arial" w:cs="Arial" w:eastAsia="Arial" w:hAnsi="Arial"/>
       <w:b/>
       <w:bCs/>
       <w:color w:val="1F4E78"/>
       <w:sz w:val="26"/>
       <w:szCs w:val="26"/>
+      <w:rFonts w:ascii="Arial" w:cs="Arial" w:eastAsia="Arial" w:hAnsi="Arial"/>
     </w:rPr>
   </w:style>
 </w:styles>

</xml_diff>